<commit_message>
Adiciona justificativa metodológica GEE+Poisson e badge reprodutibilidade
- manuscrito_v1.docx: parágrafo sobre GEE Gamma + Poisson FE adicionado
  à subseção Análise estatística (após joinpoint), com referências a
  Souza et al. 2019 e Rasella et al. 2025
- README.md: badge de reprodutibilidade (100%) e seção Citação e
  Arquivo Permanente com DOI Zenodo (a ser atualizado na publicação)

Co-Authored-By: Claude Sonnet 4.6 <noreply@anthropic.com>
</commit_message>
<xml_diff>
--- a/manuscrito/manuscrito_v1.docx
+++ b/manuscrito/manuscrito_v1.docx
@@ -1146,6 +1146,14 @@
           <w:color w:val="000000"/>
         </w:rPr>
         <w:t xml:space="preserve">Segundo, a análise joinpoint (Muggeo, 2003) identificou pontos de inflexão na série municipal e regional, expressando a variação percentual anual (APC) e a variação percentual anual média (AAPC) por segmento. Terceiro, o modelo de Poisson com efeitos fixos de dois sentidos (CS e ano) foi implementado via pacote fixest 0.14.1, com offset da população censitária de 2022, para identificar determinantes contextuais das ICSAP independentes de confundidores fixos. A heterogeneidade do efeito por IVS-BH foi avaliada por GEE AR-1 estratificado e por modelo com interação ivs_z : tempo_pós. As internações evitadas foram estimadas como a diferença entre a série observada e o contrafactual GLS (tendência pré projetada sem intervenção), com intervalos de confiança de 95% derivados de simulação Monte Carlo (n = 1.000 iterações, MASS::mvrnorm sobre a matriz de covariância do modelo GLS). O custo evitado foi calculado pelo produto das internações evitadas pelo custo médio ICSAP deflacionado pelo IPCA (R$ 2.151,61 em valores de março/2026). As análises foram conduzidas no R 4.5.3 (nlme, fixest, geepack, segmented, MASS).</w:t>
+      </w:r>
+    </w:p>
+    <w:p>
+      <w:pPr>
+        <w:pStyle w:val="Normal"/>
+      </w:pPr>
+      <w:r>
+        <w:t xml:space="preserve">Dois modelos complementares foram utilizados: (1) modelo GEE com família Gamma e link log para modelar a taxa ICSAP contínua (internações por 10.000 habitantes/mês), adequado para dados com assimetria positiva e variância proporcional à média²; e (2) modelo de Poisson com efeitos fixos por CS e por ano para modelar a contagem de internações com offset populacional, seguindo o padrão de Souza et al. (2019) e do estudo Bolsa Família (Rasella et al., 2025).</w:t>
       </w:r>
     </w:p>
     <w:p>

</xml_diff>